<commit_message>
fix(desk): doi sanh ton kho - xu ly cac loi nho con lai sau luot soat
- tru lo bi vo hieu hoa; tru thanh phan Product Bundle cua chinh don
- so mua lam tron len voi don vi so nguyen; tao MR chi nhan POST
- khong ve bang tren don da huy/da dong; bo phan hoi cu; ve hong van bao loi
- them test: nhanh Packed Item, sau giao mot phan, On Hold, MR -> PO -> nhap kho

Co-Authored-By: Claude Opus 5.5 <noreply@anthropic.com>
</commit_message>
<xml_diff>
--- a/docs/HDSD-doi-sanh-ton-kho-sales-order.docx
+++ b/docs/HDSD-doi-sanh-ton-kho-sales-order.docx
@@ -278,7 +278,7 @@
           <w:b w:val="0"/>
           <w:i w:val="0"/>
         </w:rPr>
-        <w:t xml:space="preserve"> cho tới khi giao xong.</w:t>
+        <w:t xml:space="preserve"> cho tới khi giao xong. Đơn đã huỷ hoặc đã đóng không hiện bảng.</w:t>
       </w:r>
     </w:p>
     <w:p>
@@ -599,7 +599,7 @@
                 <w:b w:val="0"/>
                 <w:i w:val="0"/>
               </w:rPr>
-              <w:t>Tồn hiện tại, trừ lô đã hết hạn, trừ phần đã giữ cho các đơn đã xác nhận khác</w:t>
+              <w:t>Tồn hiện tại, trừ lô đã hết hạn hoặc bị vô hiệu hoá, trừ phần đã giữ cho các đơn đã xác nhận khác</w:t>
             </w:r>
           </w:p>
         </w:tc>
@@ -918,7 +918,7 @@
         <w:pStyle w:val="Heading2"/>
       </w:pPr>
       <w:r>
-        <w:t>3. Hai ghi chú nhỏ dưới ô "Tồn có thể sử dụng"</w:t>
+        <w:t>3. Các ghi chú nhỏ dưới ô "Tồn có thể sử dụng"</w:t>
       </w:r>
     </w:p>
     <w:p>
@@ -1007,6 +1007,36 @@
           <w:i w:val="0"/>
         </w:rPr>
         <w:t>: đơn nháp chưa giữ hàng. Ghi chú để biết còn ai đang chờ cùng lượng hàng đó.</w:t>
+      </w:r>
+    </w:p>
+    <w:p>
+      <w:r>
+        <w:rPr>
+          <w:b/>
+          <w:i w:val="0"/>
+        </w:rPr>
+        <w:t>Bộ sản phẩm trong đơn này dùng: n</w:t>
+      </w:r>
+      <w:r>
+        <w:rPr>
+          <w:b w:val="0"/>
+          <w:i w:val="0"/>
+        </w:rPr>
+        <w:t xml:space="preserve"> — đơn vừa có một bộ sản phẩm chứa mặt hàng này, vừa có dòng lẻ của chính nó. Phần bộ sản phẩm cần </w:t>
+      </w:r>
+      <w:r>
+        <w:rPr>
+          <w:b/>
+          <w:i w:val="0"/>
+        </w:rPr>
+        <w:t>đã bị trừ</w:t>
+      </w:r>
+      <w:r>
+        <w:rPr>
+          <w:b w:val="0"/>
+          <w:i w:val="0"/>
+        </w:rPr>
+        <w:t xml:space="preserve"> khỏi tồn mà dòng lẻ nhìn thấy.</w:t>
       </w:r>
     </w:p>
     <w:p>
@@ -1973,7 +2003,23 @@
           <w:b w:val="0"/>
           <w:i w:val="0"/>
         </w:rPr>
-        <w:t xml:space="preserve"> Xem hai ghi chú ở mục 3: phần chênh là hàng đã giữ cho đơn đã xác nhận khác, hoặc là lô đã hết hạn.</w:t>
+        <w:t xml:space="preserve"> Xem các ghi chú ở mục 3: phần chênh là hàng đã giữ cho đơn đã xác nhận khác, hoặc là lô đã hết hạn hay bị vô hiệu hoá.</w:t>
+      </w:r>
+    </w:p>
+    <w:p>
+      <w:r>
+        <w:rPr>
+          <w:b/>
+          <w:i w:val="0"/>
+        </w:rPr>
+        <w:t>Thiếu 2,5 mà yêu cầu mua ghi 3?</w:t>
+      </w:r>
+      <w:r>
+        <w:rPr>
+          <w:b w:val="0"/>
+          <w:i w:val="0"/>
+        </w:rPr>
+        <w:t xml:space="preserve"> Đơn vị tồn kho của mặt hàng chỉ nhận số nguyên, nên số mua được làm tròn lên.</w:t>
       </w:r>
     </w:p>
     <w:p>

</xml_diff>